<commit_message>
Fase 1: definicion del proyecto, presentacion y evidencias individuales de Felipe Millan
</commit_message>
<xml_diff>
--- a/Fase 1/Evidencias Individuales/Millan_Felipe_1.1_APT122_AutoevaluacionCompetenciasFase1.docx
+++ b/Fase 1/Evidencias Individuales/Millan_Felipe_1.1_APT122_AutoevaluacionCompetenciasFase1.docx
@@ -854,12 +854,12 @@
             </w:pPr>
             <w:r>
               <w:rPr>
-                <w:rFonts w:eastAsia="" w:cs="Calibri" w:eastAsiaTheme="majorEastAsia" w:cstheme="minorAscii"/>
-                <w:color w:val="auto"/>
-                <w:sz w:val="24"/>
-                <w:szCs w:val="24"/>
-              </w:rPr>
-              <w:t>Escuela</w:t>
+                <w:rFonts w:ascii="Calibri" w:hAnsi="Calibri"/>
+                <w:i w:val="0"/>
+                <w:color w:val="000000"/>
+                <w:sz w:val="20"/>
+              </w:rPr>
+              <w:t>Escuela de Informática y Telecomunicaciones</w:t>
             </w:r>
           </w:p>
         </w:tc>
@@ -920,6 +920,15 @@
                 <w:szCs w:val="24"/>
               </w:rPr>
             </w:pPr>
+            <w:r>
+              <w:rPr>
+                <w:rFonts w:ascii="Calibri" w:hAnsi="Calibri"/>
+                <w:i w:val="0"/>
+                <w:color w:val="000000"/>
+                <w:sz w:val="20"/>
+              </w:rPr>
+              <w:t>Felipe Ignacio Millán Orellana</w:t>
+            </w:r>
           </w:p>
         </w:tc>
       </w:tr>
@@ -976,6 +985,15 @@
                 <w:szCs w:val="24"/>
               </w:rPr>
             </w:pPr>
+            <w:r>
+              <w:rPr>
+                <w:rFonts w:ascii="Calibri" w:hAnsi="Calibri"/>
+                <w:i w:val="0"/>
+                <w:color w:val="000000"/>
+                <w:sz w:val="20"/>
+              </w:rPr>
+              <w:t>Ingeniería en Informática</w:t>
+            </w:r>
           </w:p>
         </w:tc>
       </w:tr>
@@ -1035,6 +1053,15 @@
                 <w:szCs w:val="24"/>
               </w:rPr>
             </w:pPr>
+            <w:r>
+              <w:rPr>
+                <w:rFonts w:ascii="Calibri" w:hAnsi="Calibri"/>
+                <w:i w:val="0"/>
+                <w:color w:val="000000"/>
+                <w:sz w:val="20"/>
+              </w:rPr>
+              <w:t>[Año de ingreso]</w:t>
+            </w:r>
           </w:p>
         </w:tc>
       </w:tr>
@@ -1411,6 +1438,15 @@
                 <w:szCs w:val="18"/>
               </w:rPr>
             </w:pPr>
+            <w:r>
+              <w:rPr>
+                <w:rFonts w:ascii="Calibri" w:hAnsi="Calibri"/>
+                <w:i w:val="0"/>
+                <w:color w:val="000000"/>
+                <w:sz w:val="18"/>
+              </w:rPr>
+              <w:t>Programación de software</w:t>
+            </w:r>
           </w:p>
         </w:tc>
         <w:tc>
@@ -1447,6 +1483,15 @@
                 <w:szCs w:val="18"/>
               </w:rPr>
             </w:pPr>
+            <w:r>
+              <w:rPr>
+                <w:rFonts w:ascii="Calibri" w:hAnsi="Calibri"/>
+                <w:i w:val="0"/>
+                <w:color w:val="000000"/>
+                <w:sz w:val="20"/>
+              </w:rPr>
+              <w:t>X</w:t>
+            </w:r>
           </w:p>
         </w:tc>
         <w:tc>
@@ -1519,6 +1564,15 @@
                 <w:szCs w:val="18"/>
               </w:rPr>
             </w:pPr>
+            <w:r>
+              <w:rPr>
+                <w:rFonts w:ascii="Calibri" w:hAnsi="Calibri"/>
+                <w:i w:val="0"/>
+                <w:color w:val="000000"/>
+                <w:sz w:val="16"/>
+              </w:rPr>
+              <w:t>Obtuve la certificación. Programo con soltura en varios lenguajes (Python, GDScript, entre otros) y aplico buenas prácticas; sigo aprendiendo patrones más avanzados.</w:t>
+            </w:r>
           </w:p>
         </w:tc>
       </w:tr>
@@ -1544,6 +1598,15 @@
                 <w:szCs w:val="18"/>
               </w:rPr>
             </w:pPr>
+            <w:r>
+              <w:rPr>
+                <w:rFonts w:ascii="Calibri" w:hAnsi="Calibri"/>
+                <w:i w:val="0"/>
+                <w:color w:val="000000"/>
+                <w:sz w:val="18"/>
+              </w:rPr>
+              <w:t>Arquitectura de software</w:t>
+            </w:r>
           </w:p>
         </w:tc>
         <w:tc>
@@ -1580,6 +1643,15 @@
                 <w:szCs w:val="18"/>
               </w:rPr>
             </w:pPr>
+            <w:r>
+              <w:rPr>
+                <w:rFonts w:ascii="Calibri" w:hAnsi="Calibri"/>
+                <w:i w:val="0"/>
+                <w:color w:val="000000"/>
+                <w:sz w:val="20"/>
+              </w:rPr>
+              <w:t>X</w:t>
+            </w:r>
           </w:p>
         </w:tc>
         <w:tc>
@@ -1652,6 +1724,15 @@
                 <w:szCs w:val="18"/>
               </w:rPr>
             </w:pPr>
+            <w:r>
+              <w:rPr>
+                <w:rFonts w:ascii="Calibri" w:hAnsi="Calibri"/>
+                <w:i w:val="0"/>
+                <w:color w:val="000000"/>
+                <w:sz w:val="16"/>
+              </w:rPr>
+              <w:t>Obtuve la certificación. Puedo estructurar un sistema por capas y componentes, como en el Capstone; me falta experiencia con arquitecturas distribuidas.</w:t>
+            </w:r>
           </w:p>
         </w:tc>
       </w:tr>
@@ -1676,6 +1757,15 @@
                 <w:szCs w:val="18"/>
               </w:rPr>
             </w:pPr>
+            <w:r>
+              <w:rPr>
+                <w:rFonts w:ascii="Calibri" w:hAnsi="Calibri"/>
+                <w:i w:val="0"/>
+                <w:color w:val="000000"/>
+                <w:sz w:val="18"/>
+              </w:rPr>
+              <w:t>Calidad de software</w:t>
+            </w:r>
           </w:p>
         </w:tc>
         <w:tc>
@@ -1730,6 +1820,15 @@
                 <w:szCs w:val="18"/>
               </w:rPr>
             </w:pPr>
+            <w:r>
+              <w:rPr>
+                <w:rFonts w:ascii="Calibri" w:hAnsi="Calibri"/>
+                <w:i w:val="0"/>
+                <w:color w:val="000000"/>
+                <w:sz w:val="20"/>
+              </w:rPr>
+              <w:t>X</w:t>
+            </w:r>
           </w:p>
         </w:tc>
         <w:tc>
@@ -1784,6 +1883,15 @@
                 <w:szCs w:val="18"/>
               </w:rPr>
             </w:pPr>
+            <w:r>
+              <w:rPr>
+                <w:rFonts w:ascii="Calibri" w:hAnsi="Calibri"/>
+                <w:i w:val="0"/>
+                <w:color w:val="000000"/>
+                <w:sz w:val="16"/>
+              </w:rPr>
+              <w:t>Obtuve la certificación. Conozco los tipos de prueba y he escrito pruebas automatizadas, pero no he aplicado un proceso formal de aseguramiento de calidad.</w:t>
+            </w:r>
           </w:p>
         </w:tc>
       </w:tr>
@@ -1808,6 +1916,15 @@
                 <w:szCs w:val="18"/>
               </w:rPr>
             </w:pPr>
+            <w:r>
+              <w:rPr>
+                <w:rFonts w:ascii="Calibri" w:hAnsi="Calibri"/>
+                <w:i w:val="0"/>
+                <w:color w:val="000000"/>
+                <w:sz w:val="18"/>
+              </w:rPr>
+              <w:t>Gestión de proyectos informáticos</w:t>
+            </w:r>
           </w:p>
         </w:tc>
         <w:tc>
@@ -1844,6 +1961,15 @@
                 <w:szCs w:val="18"/>
               </w:rPr>
             </w:pPr>
+            <w:r>
+              <w:rPr>
+                <w:rFonts w:ascii="Calibri" w:hAnsi="Calibri"/>
+                <w:i w:val="0"/>
+                <w:color w:val="000000"/>
+                <w:sz w:val="20"/>
+              </w:rPr>
+              <w:t>X</w:t>
+            </w:r>
           </w:p>
         </w:tc>
         <w:tc>
@@ -1916,6 +2042,15 @@
                 <w:szCs w:val="18"/>
               </w:rPr>
             </w:pPr>
+            <w:r>
+              <w:rPr>
+                <w:rFonts w:ascii="Calibri" w:hAnsi="Calibri"/>
+                <w:i w:val="0"/>
+                <w:color w:val="000000"/>
+                <w:sz w:val="16"/>
+              </w:rPr>
+              <w:t>Obtuve la certificación. Lidero el equipo del Capstone con tablero de tareas y control de versiones; debo reforzar la estimación de tiempos y la gestión de riesgos.</w:t>
+            </w:r>
           </w:p>
         </w:tc>
       </w:tr>
@@ -1940,6 +2075,15 @@
                 <w:szCs w:val="18"/>
               </w:rPr>
             </w:pPr>
+            <w:r>
+              <w:rPr>
+                <w:rFonts w:ascii="Calibri" w:hAnsi="Calibri"/>
+                <w:i w:val="0"/>
+                <w:color w:val="000000"/>
+                <w:sz w:val="18"/>
+              </w:rPr>
+              <w:t>Análisis y planificación de requerimientos informáticos</w:t>
+            </w:r>
           </w:p>
         </w:tc>
         <w:tc>
@@ -1976,6 +2120,15 @@
                 <w:szCs w:val="18"/>
               </w:rPr>
             </w:pPr>
+            <w:r>
+              <w:rPr>
+                <w:rFonts w:ascii="Calibri" w:hAnsi="Calibri"/>
+                <w:i w:val="0"/>
+                <w:color w:val="000000"/>
+                <w:sz w:val="20"/>
+              </w:rPr>
+              <w:t>X</w:t>
+            </w:r>
           </w:p>
         </w:tc>
         <w:tc>
@@ -2048,6 +2201,15 @@
                 <w:szCs w:val="18"/>
               </w:rPr>
             </w:pPr>
+            <w:r>
+              <w:rPr>
+                <w:rFonts w:ascii="Calibri" w:hAnsi="Calibri"/>
+                <w:i w:val="0"/>
+                <w:color w:val="000000"/>
+                <w:sz w:val="16"/>
+              </w:rPr>
+              <w:t>Obtuve la certificación. He levantado requerimientos en proyectos de asignaturas y en mi práctica; me falta experiencia directa con clientes externos.</w:t>
+            </w:r>
           </w:p>
         </w:tc>
       </w:tr>
@@ -2072,6 +2234,15 @@
                 <w:szCs w:val="18"/>
               </w:rPr>
             </w:pPr>
+            <w:r>
+              <w:rPr>
+                <w:rFonts w:ascii="Calibri" w:hAnsi="Calibri"/>
+                <w:i w:val="0"/>
+                <w:color w:val="000000"/>
+                <w:sz w:val="18"/>
+              </w:rPr>
+              <w:t>Análisis y desarrollo de modelos de datos</w:t>
+            </w:r>
           </w:p>
         </w:tc>
         <w:tc>
@@ -2126,6 +2297,15 @@
                 <w:szCs w:val="18"/>
               </w:rPr>
             </w:pPr>
+            <w:r>
+              <w:rPr>
+                <w:rFonts w:ascii="Calibri" w:hAnsi="Calibri"/>
+                <w:i w:val="0"/>
+                <w:color w:val="000000"/>
+                <w:sz w:val="20"/>
+              </w:rPr>
+              <w:t>X</w:t>
+            </w:r>
           </w:p>
         </w:tc>
         <w:tc>
@@ -2180,6 +2360,15 @@
                 <w:szCs w:val="18"/>
               </w:rPr>
             </w:pPr>
+            <w:r>
+              <w:rPr>
+                <w:rFonts w:ascii="Calibri" w:hAnsi="Calibri"/>
+                <w:i w:val="0"/>
+                <w:color w:val="000000"/>
+                <w:sz w:val="16"/>
+              </w:rPr>
+              <w:t>Obtuve la certificación. Domino el modelado, pero en la práctica vi que debo reforzar SQL y consultas complejas, por lo que lo estoy estudiando.</w:t>
+            </w:r>
           </w:p>
         </w:tc>
       </w:tr>
@@ -2204,6 +2393,15 @@
                 <w:szCs w:val="18"/>
               </w:rPr>
             </w:pPr>
+            <w:r>
+              <w:rPr>
+                <w:rFonts w:ascii="Calibri" w:hAnsi="Calibri"/>
+                <w:i w:val="0"/>
+                <w:color w:val="000000"/>
+                <w:sz w:val="18"/>
+              </w:rPr>
+              <w:t>Inteligencia de negocios</w:t>
+            </w:r>
           </w:p>
         </w:tc>
         <w:tc>
@@ -2258,6 +2456,15 @@
                 <w:szCs w:val="18"/>
               </w:rPr>
             </w:pPr>
+            <w:r>
+              <w:rPr>
+                <w:rFonts w:ascii="Calibri" w:hAnsi="Calibri"/>
+                <w:i w:val="0"/>
+                <w:color w:val="000000"/>
+                <w:sz w:val="20"/>
+              </w:rPr>
+              <w:t>X</w:t>
+            </w:r>
           </w:p>
         </w:tc>
         <w:tc>
@@ -2312,6 +2519,15 @@
                 <w:szCs w:val="18"/>
               </w:rPr>
             </w:pPr>
+            <w:r>
+              <w:rPr>
+                <w:rFonts w:ascii="Calibri" w:hAnsi="Calibri"/>
+                <w:i w:val="0"/>
+                <w:color w:val="000000"/>
+                <w:sz w:val="16"/>
+              </w:rPr>
+              <w:t>Obtuve la certificación. Puedo construir reportes y dashboards, y aprobé los ramos de machine learning; quiero aplicarlo más en contextos reales.</w:t>
+            </w:r>
           </w:p>
         </w:tc>
       </w:tr>
@@ -2336,6 +2552,15 @@
                 <w:szCs w:val="18"/>
               </w:rPr>
             </w:pPr>
+            <w:r>
+              <w:rPr>
+                <w:rFonts w:ascii="Calibri" w:hAnsi="Calibri"/>
+                <w:i w:val="0"/>
+                <w:color w:val="000000"/>
+                <w:sz w:val="18"/>
+              </w:rPr>
+              <w:t>Inglés intermedio alto (certificación internacional)</w:t>
+            </w:r>
           </w:p>
         </w:tc>
         <w:tc>
@@ -2372,6 +2597,15 @@
                 <w:szCs w:val="18"/>
               </w:rPr>
             </w:pPr>
+            <w:r>
+              <w:rPr>
+                <w:rFonts w:ascii="Calibri" w:hAnsi="Calibri"/>
+                <w:i w:val="0"/>
+                <w:color w:val="000000"/>
+                <w:sz w:val="20"/>
+              </w:rPr>
+              <w:t>X</w:t>
+            </w:r>
           </w:p>
         </w:tc>
         <w:tc>
@@ -2444,6 +2678,15 @@
                 <w:szCs w:val="18"/>
               </w:rPr>
             </w:pPr>
+            <w:r>
+              <w:rPr>
+                <w:rFonts w:ascii="Calibri" w:hAnsi="Calibri"/>
+                <w:i w:val="0"/>
+                <w:color w:val="000000"/>
+                <w:sz w:val="16"/>
+              </w:rPr>
+              <w:t>Obtuve la certificación internacional. Leo documentación técnica sin problema; quiero ganar más fluidez oral.</w:t>
+            </w:r>
           </w:p>
         </w:tc>
       </w:tr>

</xml_diff>